<commit_message>
Phase 25: private sample list hidden until asked; permission scoped to the samples a question involves; wider question check; paths refused for every model; Markdown answers; thesis v4; FIGURE_MAP O
Co-Authored-By: Claude Opus 5.5 <noreply@anthropic.com>
</commit_message>
<xml_diff>
--- a/docs/thesis/Rimas_MSc_Thesis.docx
+++ b/docs/thesis/Rimas_MSc_Thesis.docx
@@ -80,7 +80,7 @@
           <w:sz w:val="20"/>
           <w:szCs w:val="20"/>
         </w:rPr>
-        <w:t xml:space="preserve">Working draft · 30 September 2026</w:t>
+        <w:t xml:space="preserve">Working draft · 2 October 2026</w:t>
       </w:r>
     </w:p>
     <w:p>
@@ -7428,17 +7428,27 @@
         <w:jc w:val="both"/>
       </w:pPr>
       <w:r>
-        <w:t xml:space="preserve">The system is delivered as a local browser interface started by a single command, binding to the loopback address and requiring no build step. The interface and the four evidence layers need no network access, nor does the chat panel, which lists only models served locally; the image tools and the gene lookup do. For every image the viewer loads the genome and a gene annotation track from the internet, and in a dry run on 29 September one of four panels timed out while the track was still loading. At startup it asserts that the two servers expose exactly eleven and four tools and refuses to start otherwise, so drift between the interface and the tool surface fails loudly.</w:t>
-      </w:r>
-    </w:p>
-    <w:p>
-      <w:pPr>
-        <w:keepNext w:val="false"/>
-        <w:spacing w:after="140" w:line="276"/>
-        <w:jc w:val="both"/>
-      </w:pPr>
-      <w:r>
-        <w:t xml:space="preserve">Every tool call passes through a single recorder that captures the tool name, the arguments as passed, the wall duration and the complete raw return. The recorder is the sole path to a tool within the interface, so every measurement the evidence panel shows comes from a recorded call; each layer count and the combined score carries a button linking to the call that produced it, and a list gives every call of the session. The attainable ceiling is not a tool return: the interface derives it from the scoring tiers, read from the scoring code at startup, and the observed fractions, over the layers the score counts.</w:t>
+        <w:t xml:space="preserve">The system is delivered as a local browser interface started by a single command, binding to the loopback address and requiring no build step. The interface, the four evidence layers and the assistant with a locally served model need no network access; the image tools, the gene lookup and the two frontier models the assistant offers when an API key is present do. For every image the viewer loads the genome and a gene annotation track from the internet, and in a dry run on 29 September one of four panels timed out while the track was still loading. At startup it asserts that the two servers expose exactly eleven and four tools and refuses to start otherwise, so drift between the interface and the tool surface fails loudly.</w:t>
+      </w:r>
+    </w:p>
+    <w:p>
+      <w:pPr>
+        <w:keepNext w:val="false"/>
+        <w:spacing w:after="140" w:line="276"/>
+        <w:jc w:val="both"/>
+      </w:pPr>
+      <w:r>
+        <w:t xml:space="preserve">Every tool call passes through a single recorder that captures the tool name, the arguments as passed, the wall duration and the complete raw return. The recorder is the sole path to a tool within the interface, so every measurement the evidence panel shows comes from a recorded call; each layer count, the combined score and the mapping-quality figure link to the call that produced it, and a log lists every call of the session. The attainable ceiling is not a tool return: the interface derives it from the scoring tiers, read from the scoring code at startup, and the observed fractions, over the layers the score counts.</w:t>
+      </w:r>
+    </w:p>
+    <w:p>
+      <w:pPr>
+        <w:keepNext w:val="false"/>
+        <w:spacing w:after="140" w:line="276"/>
+        <w:jc w:val="both"/>
+      </w:pPr>
+      <w:r>
+        <w:t xml:space="preserve">The interface is organised in three steps — the candidate list with its filter chain, the evidence at both ends of a junction, and the assistant — and marks each sample as test data, when it was found in the public data directory or declared as such, or as private data, when it was registered explicitly. A private sample's candidate list is shown only when the user asks for it; until then the interface requests counts alone, so that a blinded sample can be opened for its aggregate figures without a position reaching the screen or the call log.</w:t>
       </w:r>
     </w:p>
     <w:p>
@@ -7458,7 +7468,7 @@
         <w:jc w:val="both"/>
       </w:pPr>
       <w:r>
-        <w:t xml:space="preserve">A chat panel adds a language model as a second consumer of the same recorder rather than as a second path to the tools. The model's prose is shown apart from tool returns; every number in its final answer is checked against the returns of the same turn, a number no tool returned is shown but marked, and the model's intermediate text is shown unchecked. The check concerns numbers only: in the dry run a local model reported all seven of its numbers as the tools had returned them, yet called evidence the tool rated moderate strong.</w:t>
+        <w:t xml:space="preserve">The assistant adds a language model as a second consumer of the same recorder rather than as a second path to the tools. It addresses data by label; a file named by its path is refused. A frontier model receives private data only on the user's confirmation for that question, and only for the private samples the question names or whose positions it contains: without the confirmation it is offered the test-data labels alone and a question involving private data is not sent, and with it any call on another private sample is refused before it runs. The model's prose is shown apart from tool returns; every number in its final answer is checked against the returns of the same turn, a number no tool returned is shown but marked, and the model's intermediate text is shown unchecked. The check concerns numbers only: in the dry run a local model reported all seven of its numbers as the tools had returned them, yet called evidence the tool rated moderate strong.</w:t>
       </w:r>
     </w:p>
     <w:p>

</xml_diff>